<commit_message>
update in editquotation about editing the valid date, Scope & modules
</commit_message>
<xml_diff>
--- a/QuotationApp.API/Generated/Q-20260825-68051adc.docx
+++ b/QuotationApp.API/Generated/Q-20260825-68051adc.docx
@@ -156,7 +156,7 @@
           <w:bCs/>
           <w:color w:val="65AADB"/>
         </w:rPr>
-        <w:t xml:space="preserve">Reference: Our discussions on implementation of Audit Tracker in your organization.</w:t>
+        <w:t xml:space="preserve">Reference: Our discussions on implementation of Audit Tracker &amp; LPA (Layered Process Audits) in your organization.</w:t>
       </w:r>
       <w:r>
         <w:t xml:space="preserve"/>
@@ -183,7 +183,7 @@
           <w:bCs/>
           <w:color w:val="65AADB"/>
         </w:rPr>
-        <w:t xml:space="preserve">Subject: Business proposal for IT &amp; Operations changeover consultancy and implementation of Audit Tracker.</w:t>
+        <w:t xml:space="preserve">Subject: Business proposal for IT &amp; Operations changeover consultancy and implementation of Audit Tracker &amp; LPA (Layered Process Audits).</w:t>
       </w:r>
       <w:r>
         <w:t xml:space="preserve"/>
@@ -288,7 +288,7 @@
         <w:spacing w:after="100"/>
       </w:pPr>
       <w:r>
-        <w:t xml:space="preserve">Digitization of Audit Tracker replaces manual documentation, accelerates the approval process through centralized data management, and improves traceability while reducing administrative overhead.</w:t>
+        <w:t xml:space="preserve">Digitization of Audit Tracker &amp; LPA (Layered Process Audits) replaces manual documentation, accelerates the approval process through centralized data management, and improves traceability while reducing administrative overhead.</w:t>
       </w:r>
       <w:r>
         <w:rPr>
@@ -370,7 +370,7 @@
         <w:spacing w:after="200"/>
       </w:pPr>
       <w:r>
-        <w:t xml:space="preserve">Training and implementation using CQUAL Audit Tracker</w:t>
+        <w:t xml:space="preserve">Training and implementation using CQUAL Audit Tracker &amp; LPA (Layered Process Audits)</w:t>
       </w:r>
       <w:r>
         <w:rPr>
@@ -573,6 +573,74 @@
           </w:p>
         </w:tc>
       </w:tr>
+      <w:tr>
+        <w:tc>
+          <w:tcPr>
+            <w:tcW w:w="2200" w:type="dxa"/>
+            <w:tcMar>
+              <w:top w:w="80" w:type="dxa"/>
+              <w:left w:w="120" w:type="dxa"/>
+              <w:bottom w:w="80" w:type="dxa"/>
+              <w:right w:w="120" w:type="dxa"/>
+            </w:tcMar>
+            <w:vAlign w:val="center"/>
+          </w:tcPr>
+          <w:p>
+            <w:r>
+              <w:rPr>
+                <w:sz w:val="20"/>
+                <w:szCs w:val="20"/>
+              </w:rPr>
+              <w:t xml:space="preserve">Quality</w:t>
+            </w:r>
+          </w:p>
+        </w:tc>
+        <w:tc>
+          <w:tcPr>
+            <w:tcW w:w="5200" w:type="dxa"/>
+            <w:tcMar>
+              <w:top w:w="80" w:type="dxa"/>
+              <w:left w:w="120" w:type="dxa"/>
+              <w:bottom w:w="80" w:type="dxa"/>
+              <w:right w:w="120" w:type="dxa"/>
+            </w:tcMar>
+            <w:vAlign w:val="center"/>
+          </w:tcPr>
+          <w:p>
+            <w:r>
+              <w:rPr>
+                <w:sz w:val="20"/>
+                <w:szCs w:val="20"/>
+              </w:rPr>
+              <w:t xml:space="preserve">LPA (Layered Process Audits)</w:t>
+            </w:r>
+          </w:p>
+        </w:tc>
+        <w:tc>
+          <w:tcPr>
+            <w:tcW w:w="1600" w:type="dxa"/>
+            <w:tcMar>
+              <w:top w:w="80" w:type="dxa"/>
+              <w:left w:w="120" w:type="dxa"/>
+              <w:bottom w:w="80" w:type="dxa"/>
+              <w:right w:w="120" w:type="dxa"/>
+            </w:tcMar>
+            <w:vAlign w:val="center"/>
+          </w:tcPr>
+          <w:p>
+            <w:r>
+              <w:rPr>
+                <w:b/>
+                <w:bCs/>
+                <w:color w:val="65AADB"/>
+                <w:sz w:val="20"/>
+                <w:szCs w:val="20"/>
+              </w:rPr>
+              <w:t xml:space="preserve">Yes</w:t>
+            </w:r>
+          </w:p>
+        </w:tc>
+      </w:tr>
     </w:tbl>
     <w:p>
       <w:pPr>
@@ -734,7 +802,7 @@
                 <w:sz w:val="20"/>
                 <w:szCs w:val="20"/>
               </w:rPr>
-              <w:t xml:space="preserve">Audit Tracker - Product License applicable for single installation.
+              <w:t xml:space="preserve">Audit Tracker &amp; LPA (Layered Process Audits) - Product License applicable for single installation.
 Scope – As mentioned above</w:t>
             </w:r>
           </w:p>
@@ -756,7 +824,7 @@
                 <w:sz w:val="20"/>
                 <w:szCs w:val="20"/>
               </w:rPr>
-              <w:t xml:space="preserve">₹1,00,000</w:t>
+              <w:t xml:space="preserve">₹2,50,000</w:t>
             </w:r>
           </w:p>
         </w:tc>
@@ -1844,7 +1912,7 @@
           <w:sz w:val="20"/>
           <w:szCs w:val="20"/>
         </w:rPr>
-        <w:t xml:space="preserve"> This Offer is valid up to 08 Aug 2026.</w:t>
+        <w:t xml:space="preserve"> This Offer is valid up to 01 Aug 2026.</w:t>
       </w:r>
     </w:p>
     <w:p>
@@ -2111,43 +2179,7 @@
         <w:sz w:val="24"/>
         <w:szCs w:val="24"/>
       </w:rPr>
-      <w:r>
-        <w:drawing>
-          <wp:inline>
-            <wp:extent cx="1428750" cy="381000"/>
-            <wp:effectExtent l="0" t="0" r="0" b="0"/>
-            <wp:docPr id="1" name="Logo"/>
-            <wp:cNvGraphicFramePr>
-              <a:graphicFrameLocks xmlns:a="http://schemas.openxmlformats.org/drawingml/2006/main" noChangeAspect="1"/>
-            </wp:cNvGraphicFramePr>
-            <a:graphic xmlns:a="http://schemas.openxmlformats.org/drawingml/2006/main">
-              <a:graphicData uri="http://schemas.openxmlformats.org/drawingml/2006/picture">
-                <pic:pic xmlns:pic="http://schemas.openxmlformats.org/drawingml/2006/picture">
-                  <pic:nvPicPr>
-                    <pic:cNvPr id="0" name="Logo"/>
-                    <pic:cNvPicPr/>
-                  </pic:nvPicPr>
-                  <pic:blipFill>
-                    <a:blip r:embed="R2ea3fe2908234db3"/>
-                    <a:stretch>
-                      <a:fillRect/>
-                    </a:stretch>
-                  </pic:blipFill>
-                  <pic:spPr>
-                    <a:xfrm>
-                      <a:off x="0" y="0"/>
-                      <a:ext cx="1428750" cy="381000"/>
-                    </a:xfrm>
-                    <a:prstGeom prst="rect">
-                      <a:avLst/>
-                    </a:prstGeom>
-                  </pic:spPr>
-                </pic:pic>
-              </a:graphicData>
-            </a:graphic>
-          </wp:inline>
-        </w:drawing>
-      </w:r>
+      <w:t xml:space="preserve">BlechTek Software Solutions LLP</w:t>
     </w:r>
     <w:r>
       <w:rPr>

</xml_diff>